<commit_message>
Refresh analysis outputs and publication figures
Co-authored-by: Copilot <223556219+Copilot@users.noreply.github.com>
</commit_message>
<xml_diff>
--- a/output/Method.docx
+++ b/output/Method.docx
@@ -4,213 +4,99 @@
   <w:body>
     <w:p>
       <w:pPr>
-        <w:pStyle w:val="berschrift2"/>
         <w:rPr>
-          <w:lang w:val="en-GB"/>
+          <w:b/>
+          <w:bCs/>
         </w:rPr>
       </w:pPr>
       <w:r>
         <w:rPr>
-          <w:lang w:val="en-GB"/>
+          <w:b/>
+          <w:bCs/>
         </w:rPr>
         <w:t>Method</w:t>
       </w:r>
-    </w:p>
-    <w:p>
-      <w:pPr>
+      <w:r>
         <w:rPr>
-          <w:lang w:val="en-GB"/>
+          <w:b/>
+          <w:bCs/>
         </w:rPr>
-      </w:pPr>
-      <w:r>
+        <w:t xml:space="preserve"> (AI-written, human edited)</w:t>
+      </w:r>
+    </w:p>
+    <w:p>
+      <w:r>
+        <w:t>This study combines large language model (LLM)-based document analysis with an iterative, human-supervised development process to extract and validate structured information from policy briefs. The approach operates at two levels: (i) the analytical pipeline applied to the documents, and (ii) the meta-level workflow used to design, refine, and validate this pipeline using AI-assisted coding.</w:t>
+      </w:r>
+    </w:p>
+    <w:p>
+      <w:r>
+        <w:t>At the analytical level, the pipeline converts unstructured policy briefs into structured datasets through a series of LLM-based extraction tasks. At the meta level, the system itself was developed through iterative interaction with AI coding agents, with repeated human supervision and validation to ensure methodological alignment, transparency, and extraction quality.</w:t>
+      </w:r>
+    </w:p>
+    <w:p>
+      <w:pPr>
         <w:rPr>
-          <w:lang w:val="en-GB"/>
+          <w:b/>
+          <w:bCs/>
         </w:rPr>
-        <w:t>This study combines large language model (LLM)–based document analysis with an iterative, human-supervised development process to extract and validate structured information from policy briefs. The approach operates at two levels: (</w:t>
-      </w:r>
-      <w:proofErr w:type="spellStart"/>
+      </w:pPr>
       <w:r>
         <w:rPr>
-          <w:lang w:val="en-GB"/>
-        </w:rPr>
-        <w:t>i</w:t>
-      </w:r>
-      <w:proofErr w:type="spellEnd"/>
-      <w:r>
-        <w:rPr>
-          <w:lang w:val="en-GB"/>
-        </w:rPr>
-        <w:t>) the analytical pipeline applied to the documents, and (ii) the meta-level workflow used to design, refine, and validate this pipeline using AI-assisted coding.</w:t>
-      </w:r>
-    </w:p>
-    <w:p>
-      <w:pPr>
-        <w:rPr>
-          <w:lang w:val="en-GB"/>
-        </w:rPr>
-      </w:pPr>
-      <w:r>
-        <w:rPr>
-          <w:lang w:val="en-GB"/>
-        </w:rPr>
-        <w:t>At the analytical level, the pipeline converts unstructured policy briefs into structured datasets by applying multiple LLM-based extraction tasks in sequence. At the meta level, the system itself was developed through iterative interaction with AI coding agents, with repeated human supervision and validation to ensure methodological alignment and extraction quality.</w:t>
-      </w:r>
-    </w:p>
-    <w:p>
-      <w:pPr>
-        <w:pStyle w:val="berschrift3"/>
-        <w:rPr>
-          <w:lang w:val="en-GB"/>
-        </w:rPr>
-      </w:pPr>
-      <w:r>
-        <w:rPr>
-          <w:lang w:val="en-GB"/>
+          <w:b/>
+          <w:bCs/>
         </w:rPr>
         <w:t>AI-assisted pipeline development</w:t>
       </w:r>
     </w:p>
     <w:p>
+      <w:r>
+        <w:t xml:space="preserve">The codebase was developed almost entirely using an AI coding agent (Claude Sonnet 4.6), following a structured, multi-step process. For each major component, the agent was first instructed to produce a detailed implementation plan. These plans were then iteratively revised through human review and feedback, as well as independent plan-review support from a second LLM system. Only after the plans matched the intended analytical design </w:t>
+      </w:r>
+      <w:proofErr w:type="gramStart"/>
+      <w:r>
+        <w:t>were</w:t>
+      </w:r>
+      <w:proofErr w:type="gramEnd"/>
+      <w:r>
+        <w:t xml:space="preserve"> they implemented and tested.</w:t>
+      </w:r>
+    </w:p>
+    <w:p>
+      <w:r>
+        <w:t>This process required three major development iterations. In the first iteration, the pipeline was implemented based on high-level specifications of the extraction tasks. Following an initial run and manual inspection of outputs, limitations became apparent, particularly in the distinction between recommendations and policy options and the inclusion of content from introductory or reference sections of the policy briefs. The second iteration therefore focused on refining extraction prompts to more strictly define valid recommendations, enforce mutual exclusivity between recommendation and policy-option categories, and explicitly exclude bibliographic or background content.</w:t>
+      </w:r>
+    </w:p>
+    <w:p>
+      <w:r>
+        <w:t xml:space="preserve">In the third iteration, the pipeline was extended to support a dual-source recommendation analysis design. In addition to recommendation and policy-option passages automatically identified from complete policy briefs, human coders independently identified recommendation and solution passages from explicitly relevant sections of the same documents. Both sources were subsequently subjected to the same structured extraction procedures. This enabled systematic comparison between human-selected and LLM-selected analytical inputs while preserving a clear distinction between source </w:t>
+      </w:r>
+      <w:proofErr w:type="gramStart"/>
+      <w:r>
+        <w:t>provenance</w:t>
+      </w:r>
+      <w:proofErr w:type="gramEnd"/>
+      <w:r>
+        <w:t>.</w:t>
+      </w:r>
+    </w:p>
+    <w:p/>
+    <w:p/>
+    <w:p>
       <w:pPr>
         <w:rPr>
-          <w:lang w:val="en-GB"/>
+          <w:b/>
+          <w:bCs/>
+          <w:sz w:val="28"/>
+          <w:szCs w:val="28"/>
         </w:rPr>
       </w:pPr>
       <w:r>
         <w:rPr>
-          <w:lang w:val="en-GB"/>
-        </w:rPr>
-        <w:t xml:space="preserve">The codebase was developed almost entirely using an AI coding agent (Claude Sonnet 4.6), following a structured, multi-step process. For each major component, the agent was first instructed to produce a detailed implementation plan. These plans were then iteratively revised through human review and feedback, as well as independent plan-review support from a second AI system (ChatGPT 5.4). Only after the plans matched the intended analytical design </w:t>
-      </w:r>
-      <w:proofErr w:type="gramStart"/>
-      <w:r>
-        <w:rPr>
-          <w:lang w:val="en-GB"/>
-        </w:rPr>
-        <w:t>were</w:t>
-      </w:r>
-      <w:proofErr w:type="gramEnd"/>
-      <w:r>
-        <w:rPr>
-          <w:lang w:val="en-GB"/>
-        </w:rPr>
-        <w:t xml:space="preserve"> they implemented</w:t>
-      </w:r>
-      <w:r>
-        <w:rPr>
-          <w:lang w:val="en-GB"/>
-        </w:rPr>
-        <w:t xml:space="preserve"> and tested</w:t>
-      </w:r>
-      <w:r>
-        <w:rPr>
-          <w:lang w:val="en-GB"/>
-        </w:rPr>
-        <w:t>.</w:t>
-      </w:r>
-    </w:p>
-    <w:p>
-      <w:pPr>
-        <w:rPr>
-          <w:lang w:val="en-GB"/>
-        </w:rPr>
-      </w:pPr>
-      <w:r>
-        <w:rPr>
-          <w:lang w:val="en-GB"/>
-        </w:rPr>
-        <w:t xml:space="preserve">This process required three major development iterations. In the first iteration, the pipeline was implemented based on high-level specifications of the extraction tasks. Following an initial run and manual inspection of outputs, limitations became apparent, particularly in the distinction between recommendations and policy options and the inclusion of content from </w:t>
-      </w:r>
-      <w:r>
-        <w:rPr>
-          <w:lang w:val="en-GB"/>
-        </w:rPr>
-        <w:t xml:space="preserve">the introductory or </w:t>
-      </w:r>
-      <w:r>
-        <w:rPr>
-          <w:lang w:val="en-GB"/>
-        </w:rPr>
-        <w:t>reference sections</w:t>
-      </w:r>
-      <w:r>
-        <w:rPr>
-          <w:lang w:val="en-GB"/>
-        </w:rPr>
-        <w:t xml:space="preserve"> of the policy briefs</w:t>
-      </w:r>
-      <w:r>
-        <w:rPr>
-          <w:lang w:val="en-GB"/>
-        </w:rPr>
-        <w:t xml:space="preserve">. The second iteration therefore focused on refining the extraction prompts to more strictly define valid recommendations, enforce mutual exclusivity between recommendation and option categories, and explicitly exclude bibliographic </w:t>
-      </w:r>
-      <w:r>
-        <w:rPr>
-          <w:lang w:val="en-GB"/>
-        </w:rPr>
-        <w:t xml:space="preserve">or introductory background </w:t>
-      </w:r>
-      <w:r>
-        <w:rPr>
-          <w:lang w:val="en-GB"/>
-        </w:rPr>
-        <w:t>content.</w:t>
-      </w:r>
-      <w:r>
-        <w:rPr>
-          <w:lang w:val="en-GB"/>
-        </w:rPr>
-        <w:t xml:space="preserve"> </w:t>
-      </w:r>
-    </w:p>
-    <w:p>
-      <w:pPr>
-        <w:rPr>
-          <w:lang w:val="en-GB"/>
-        </w:rPr>
-      </w:pPr>
-      <w:r>
-        <w:rPr>
-          <w:lang w:val="en-GB"/>
-        </w:rPr>
-        <w:t xml:space="preserve">In the third iteration, the pipeline was extended to support a dual-pass extraction design. </w:t>
-      </w:r>
-      <w:r>
-        <w:rPr>
-          <w:lang w:val="en-GB"/>
-        </w:rPr>
-        <w:t xml:space="preserve">This step was motivated by our desire to include a cross-verification of extracted policy recommendations. For that, we manually extracted all recommendations mentioned in explicitly labelled relevant sections in the policy briefs. This replicated the AI-extracted dataset of recommendation </w:t>
-      </w:r>
-      <w:r>
-        <w:rPr>
-          <w:lang w:val="en-GB"/>
-        </w:rPr>
-        <w:t>snippets (single sentences)</w:t>
-      </w:r>
-      <w:r>
-        <w:rPr>
-          <w:lang w:val="en-GB"/>
-        </w:rPr>
-        <w:t xml:space="preserve"> from the full text. </w:t>
-      </w:r>
-      <w:r>
-        <w:rPr>
-          <w:lang w:val="en-GB"/>
-        </w:rPr>
-        <w:t>This allowed for systematic cross-validation between AI-derived outputs and human-coded data.</w:t>
-      </w:r>
-    </w:p>
-    <w:p>
-      <w:pPr>
-        <w:pStyle w:val="berschrift2"/>
-        <w:rPr>
-          <w:lang w:val="en-GB"/>
-        </w:rPr>
-      </w:pPr>
-      <w:r>
-        <w:rPr>
-          <w:lang w:val="en-GB"/>
+          <w:b/>
+          <w:bCs/>
+          <w:sz w:val="28"/>
+          <w:szCs w:val="28"/>
         </w:rPr>
         <w:lastRenderedPageBreak/>
         <w:t>Document processing and extraction pipeline</w:t>
@@ -218,367 +104,236 @@
     </w:p>
     <w:p>
       <w:pPr>
-        <w:pStyle w:val="berschrift3"/>
         <w:rPr>
-          <w:lang w:val="en-GB"/>
+          <w:b/>
+          <w:bCs/>
         </w:rPr>
       </w:pPr>
       <w:r>
         <w:rPr>
-          <w:lang w:val="en-GB"/>
+          <w:b/>
+          <w:bCs/>
         </w:rPr>
         <w:t>Text extraction and preprocessing</w:t>
       </w:r>
     </w:p>
     <w:p>
+      <w:r>
+        <w:t>Policy briefs in PDF format are converted into structured text at the page level. The extracted content retains page-level segmentation and basic layout information. Basic document metrics, such as document length and lexical characteristics, are calculated using deterministic rules to minimize unnecessary computational resource consumption.</w:t>
+      </w:r>
+    </w:p>
+    <w:p>
       <w:pPr>
         <w:rPr>
-          <w:lang w:val="en-GB"/>
+          <w:b/>
+          <w:bCs/>
         </w:rPr>
       </w:pPr>
       <w:r>
         <w:rPr>
-          <w:lang w:val="en-GB"/>
-        </w:rPr>
-        <w:t>Policy briefs in PDF format are converted into structured text at the page level. The extracted content retains page-level segmentation and basic layout information. Basic document metrics, such as length and lexical properties, are computed using deterministic rules</w:t>
-      </w:r>
-      <w:r>
-        <w:rPr>
-          <w:lang w:val="en-GB"/>
-        </w:rPr>
-        <w:t>, to reduce unnecessary computational resource consumption</w:t>
-      </w:r>
-      <w:r>
-        <w:rPr>
-          <w:lang w:val="en-GB"/>
-        </w:rPr>
-        <w:t>.</w:t>
-      </w:r>
-    </w:p>
-    <w:p>
-      <w:pPr>
-        <w:pStyle w:val="berschrift3"/>
-        <w:rPr>
-          <w:lang w:val="en-GB"/>
-        </w:rPr>
-      </w:pPr>
-      <w:r>
-        <w:rPr>
-          <w:lang w:val="en-GB"/>
+          <w:b/>
+          <w:bCs/>
         </w:rPr>
         <w:t>Multi-pass LLM analysis of full documents</w:t>
       </w:r>
     </w:p>
     <w:p>
-      <w:pPr>
-        <w:rPr>
-          <w:lang w:val="en-GB"/>
-        </w:rPr>
-      </w:pPr>
-      <w:r>
-        <w:rPr>
-          <w:lang w:val="en-GB"/>
-        </w:rPr>
-        <w:t xml:space="preserve">The core analysis is performed through </w:t>
-      </w:r>
-      <w:r>
-        <w:rPr>
-          <w:lang w:val="en-GB"/>
-        </w:rPr>
-        <w:t>four</w:t>
-      </w:r>
-      <w:r>
-        <w:rPr>
-          <w:lang w:val="en-GB"/>
-        </w:rPr>
-        <w:t xml:space="preserve"> LLM-based passes over the full document text.</w:t>
-      </w:r>
-      <w:r>
-        <w:rPr>
-          <w:lang w:val="en-GB"/>
-        </w:rPr>
-        <w:t xml:space="preserve"> We performed API queries to OpenAI</w:t>
-      </w:r>
-      <w:r>
-        <w:rPr>
-          <w:lang w:val="en-US"/>
-        </w:rPr>
-        <w:t>’s</w:t>
-      </w:r>
-      <w:r>
-        <w:rPr>
-          <w:lang w:val="en-GB"/>
-        </w:rPr>
-        <w:t xml:space="preserve"> </w:t>
+      <w:r>
+        <w:t xml:space="preserve">The core analysis is performed through four LLM-based passes over the full document text. We performed API queries to OpenAI's </w:t>
       </w:r>
       <w:r>
         <w:rPr>
           <w:i/>
           <w:iCs/>
-          <w:lang w:val="en-GB"/>
         </w:rPr>
         <w:t>gpt-4o-mini</w:t>
       </w:r>
       <w:r>
+        <w:t xml:space="preserve"> (accessed June 2026), which supports structured JSON outputs at comparatively low cost and allows scalable processing of large document collections.</w:t>
+      </w:r>
+    </w:p>
+    <w:p>
+      <w:r>
+        <w:t>First, metadata are extracted from the document text (e.g., title, authors, affiliations, funding statements), strictly based on explicitly stated information. Institutional affiliations are additionally categorized into broad organizational types (e.g., university, research institute, NGO). The presence of visual elements is also inferred from explicit references to figures, tables, charts, or similar graphical components.</w:t>
+      </w:r>
+    </w:p>
+    <w:p>
+      <w:r>
+        <w:t>Second, the structural components of each document are assessed. This includes identifying whether a policy problem is explicitly defined, whether solutions are proposed, and whether implementation considerations are discussed. These elements are categorized using standardized labels (e.g., present, weak, absent).</w:t>
+      </w:r>
+    </w:p>
+    <w:p>
+      <w:r>
+        <w:t>Third, policy-relevant content is extracted using a dedicated LLM prompt. The model identifies and classifies items into predefined categories, including recommendations, policy options, implementation steps, expected outcomes, trade-offs, and actor responsibilities. Each extracted item is linked to a verbatim quote from the source document and its location. Strict rules ensure that only explicit policy guidance is extracted, while background discussion, descriptive statements, and purely interpretive content are excluded. Recommendations and policy options are treated as mutually exclusive categories.</w:t>
+      </w:r>
+    </w:p>
+    <w:p>
+      <w:r>
+        <w:t>For downstream recommendation-level analyses, only items classified as recommendations or policy options are retained. Other extracted categories are preserved for descriptive analysis, quality assurance, and interpretation but are not used as primary recommendation units.</w:t>
+      </w:r>
+    </w:p>
+    <w:p>
+      <w:r>
+        <w:t xml:space="preserve">Fourth, documents are analysed for the presence of predefined policy-instrument frames. Each frame is assessed independently based on explicit textual evidence. </w:t>
+      </w:r>
+      <w:r>
+        <w:lastRenderedPageBreak/>
+        <w:t>These document-level frames are analytically distinct from recommendation-level policy-instrument classifications associated with individual recommendations.</w:t>
+      </w:r>
+    </w:p>
+    <w:p>
+      <w:r>
+        <w:t>All LLM outputs are validated and normalized through deterministic post-processing procedures, including verification of extracted quotations, removal of duplicate or overlapping extractions, confidence filtering, and standardization of categorical labels.</w:t>
+      </w:r>
+    </w:p>
+    <w:p>
+      <w:pPr>
         <w:rPr>
-          <w:lang w:val="en-GB"/>
+          <w:b/>
+          <w:bCs/>
         </w:rPr>
-        <w:t xml:space="preserve"> (accessed in June 2026)</w:t>
-      </w:r>
+      </w:pPr>
       <w:r>
         <w:rPr>
-          <w:lang w:val="en-GB"/>
+          <w:b/>
+          <w:bCs/>
         </w:rPr>
-        <w:t>, which can return a structured (</w:t>
-      </w:r>
-      <w:proofErr w:type="spellStart"/>
-      <w:r>
+        <w:t>Provenance-aware recommendation analysis</w:t>
+      </w:r>
+    </w:p>
+    <w:p>
+      <w:r>
+        <w:t>All downstream recommendation analyses retain explicit source provenance. Outputs are labelled according to whether they originate from:</w:t>
+      </w:r>
+    </w:p>
+    <w:p>
+      <w:pPr>
+        <w:numPr>
+          <w:ilvl w:val="0"/>
+          <w:numId w:val="3"/>
+        </w:numPr>
+      </w:pPr>
+      <w:r>
+        <w:t>complete policy-brief text,</w:t>
+      </w:r>
+    </w:p>
+    <w:p>
+      <w:pPr>
+        <w:numPr>
+          <w:ilvl w:val="0"/>
+          <w:numId w:val="3"/>
+        </w:numPr>
+      </w:pPr>
+      <w:r>
+        <w:t>recommendation or policy-option passages identified by the LLM from complete briefs, or</w:t>
+      </w:r>
+    </w:p>
+    <w:p>
+      <w:pPr>
+        <w:numPr>
+          <w:ilvl w:val="0"/>
+          <w:numId w:val="3"/>
+        </w:numPr>
+      </w:pPr>
+      <w:r>
+        <w:t>recommendation or solution passages identified by human coders.</w:t>
+      </w:r>
+    </w:p>
+    <w:p>
+      <w:r>
+        <w:t>Maintaining these distinctions prevents conflation of document-level and recommendation-level findings and enables transparent comparison between alternative extraction routes.</w:t>
+      </w:r>
+    </w:p>
+    <w:p>
+      <w:pPr>
         <w:rPr>
-          <w:lang w:val="en-GB"/>
+          <w:b/>
+          <w:bCs/>
         </w:rPr>
-        <w:t>json</w:t>
-      </w:r>
-      <w:proofErr w:type="spellEnd"/>
+      </w:pPr>
       <w:r>
         <w:rPr>
-          <w:lang w:val="en-GB"/>
+          <w:b/>
+          <w:bCs/>
         </w:rPr>
-        <w:t xml:space="preserve">) output format at </w:t>
-      </w:r>
-      <w:r>
+        <w:t>Segment-level re-analysis</w:t>
+      </w:r>
+    </w:p>
+    <w:p>
+      <w:r>
+        <w:t>Recommendation-level information is analysed separately from full-document processing through a dedicated segment-level analysis stage.</w:t>
+      </w:r>
+    </w:p>
+    <w:p>
+      <w:r>
+        <w:t xml:space="preserve">Two sources of segments are used. First, recommendation and policy-option passages identified during the full-document extraction stage are analysed independently as standalone text units. Second, manually identified recommendation and solution passages are analysed using </w:t>
+      </w:r>
+      <w:proofErr w:type="gramStart"/>
+      <w:r>
+        <w:t>exactly the same</w:t>
+      </w:r>
+      <w:proofErr w:type="gramEnd"/>
+      <w:r>
+        <w:t xml:space="preserve"> structured extraction procedures. For both sources, the model extracts information such as policy instruments, expected outcomes, implementation guidance, trade-offs, and responsible actors.</w:t>
+      </w:r>
+    </w:p>
+    <w:p>
+      <w:r>
+        <w:t>This design serves two purposes. First, it allows comparison between human-selected and LLM-selected recommendation passages. Second, it enables assessment of context effects by comparing extraction results obtained from complete-document context with those obtained from isolated recommendation passages.</w:t>
+      </w:r>
+    </w:p>
+    <w:p>
+      <w:pPr>
         <w:rPr>
-          <w:lang w:val="en-GB"/>
+          <w:b/>
+          <w:bCs/>
         </w:rPr>
-        <w:t xml:space="preserve">comparably </w:t>
-      </w:r>
+      </w:pPr>
       <w:r>
         <w:rPr>
-          <w:lang w:val="en-GB"/>
-        </w:rPr>
-        <w:t xml:space="preserve">low cost for scalability. </w:t>
-      </w:r>
-      <w:r>
-        <w:rPr>
-          <w:lang w:val="en-GB"/>
-        </w:rPr>
-        <w:t xml:space="preserve">First, metadata is extracted from the document </w:t>
-      </w:r>
-      <w:r>
-        <w:rPr>
-          <w:lang w:val="en-GB"/>
-        </w:rPr>
-        <w:t xml:space="preserve">text </w:t>
-      </w:r>
-      <w:r>
-        <w:rPr>
-          <w:lang w:val="en-GB"/>
-        </w:rPr>
-        <w:t>(e.g. title, authors, affiliations, funding statements), strictly based on explicitly stated information. Institutional affiliations are also categorized into broad types (e.g. university, research institute, NGO). In addition, the presence of visual elements is inferred from textual references to figures, tables, or charts.</w:t>
-      </w:r>
-    </w:p>
-    <w:p>
-      <w:pPr>
-        <w:rPr>
-          <w:lang w:val="en-GB"/>
-        </w:rPr>
-      </w:pPr>
-      <w:r>
-        <w:rPr>
-          <w:lang w:val="en-GB"/>
-        </w:rPr>
-        <w:t>Second, the structural components of each document are assessed. This includes identifying whether a policy problem is explicitly defined, whether solutions are proposed, and whether implementation considerations are discussed. These elements are categorized using standardized labels (e.g. present, weak, absent).</w:t>
-      </w:r>
-    </w:p>
-    <w:p>
-      <w:pPr>
-        <w:rPr>
-          <w:lang w:val="en-GB"/>
-        </w:rPr>
-      </w:pPr>
-      <w:r>
-        <w:rPr>
-          <w:lang w:val="en-GB"/>
-        </w:rPr>
-        <w:t>Third, policy-relevant content is extracted using a dedicated LLM prompt. The model identifies and classifies items into predefined categories, including recommendations, policy options, implementation steps, expected outcomes, trade-offs, and actor responsibilities. Each extracted item is linked to a verbatim quote from the document and its source location. Strict rules ensure that only explicit policy guidance is extracted, background or interpretive statements are excluded, and that recommendations and policy options are clearly distinguished.</w:t>
-      </w:r>
-    </w:p>
-    <w:p>
-      <w:pPr>
-        <w:rPr>
-          <w:lang w:val="en-GB"/>
-        </w:rPr>
-      </w:pPr>
-      <w:r>
-        <w:rPr>
-          <w:lang w:val="en-GB"/>
-        </w:rPr>
-        <w:t xml:space="preserve">Fourth, documents are </w:t>
-      </w:r>
-      <w:r>
-        <w:rPr>
-          <w:lang w:val="en-GB"/>
-        </w:rPr>
-        <w:t>analysed</w:t>
-      </w:r>
-      <w:r>
-        <w:rPr>
-          <w:lang w:val="en-GB"/>
-        </w:rPr>
-        <w:t xml:space="preserve"> for the presence of predefined policy instrument “frames”, with each frame assessed independently based on explicit evidence in the text.</w:t>
-      </w:r>
-    </w:p>
-    <w:p>
-      <w:pPr>
-        <w:rPr>
-          <w:lang w:val="en-GB"/>
-        </w:rPr>
-      </w:pPr>
-      <w:r>
-        <w:rPr>
-          <w:lang w:val="en-GB"/>
-        </w:rPr>
-        <w:t>All LLM outputs are validated and normalized through deterministic post-processing steps, including verification of extracted quotations, deduplication of overlapping items, and standardization of categorical labels.</w:t>
-      </w:r>
-    </w:p>
-    <w:p>
-      <w:pPr>
-        <w:pStyle w:val="berschrift3"/>
-        <w:rPr>
-          <w:lang w:val="en-GB"/>
-        </w:rPr>
-      </w:pPr>
-      <w:r>
-        <w:rPr>
-          <w:lang w:val="en-GB"/>
-        </w:rPr>
-        <w:t>Snippet-level re-analysis</w:t>
-      </w:r>
-    </w:p>
-    <w:p>
-      <w:pPr>
-        <w:rPr>
-          <w:lang w:val="en-GB"/>
-        </w:rPr>
-      </w:pPr>
-      <w:r>
-        <w:rPr>
-          <w:lang w:val="en-GB"/>
-        </w:rPr>
-        <w:t xml:space="preserve">To assess the sensitivity of extraction results to context, the recommendation extraction procedure is applied a second time to isolated text segments representing policy </w:t>
-      </w:r>
-      <w:r>
-        <w:rPr>
-          <w:lang w:val="en-GB"/>
-        </w:rPr>
-        <w:lastRenderedPageBreak/>
-        <w:t xml:space="preserve">solutions. This second pass uses </w:t>
-      </w:r>
-      <w:proofErr w:type="gramStart"/>
-      <w:r>
-        <w:rPr>
-          <w:lang w:val="en-GB"/>
-        </w:rPr>
-        <w:t>exactly the same</w:t>
-      </w:r>
-      <w:proofErr w:type="gramEnd"/>
-      <w:r>
-        <w:rPr>
-          <w:lang w:val="en-GB"/>
-        </w:rPr>
-        <w:t xml:space="preserve"> LLM prompt and extraction logic as the full-document analysis but operates on shorter text inputs.</w:t>
-      </w:r>
-    </w:p>
-    <w:p>
-      <w:pPr>
-        <w:rPr>
-          <w:lang w:val="en-GB"/>
-        </w:rPr>
-      </w:pPr>
-      <w:r>
-        <w:rPr>
-          <w:lang w:val="en-GB"/>
-        </w:rPr>
-        <w:t>Two sources of segments are used. First, solution statements extracted during the full-document pass are reprocessed in isolation. Second, manually coded solution segments are used as independent inputs. In both cases, each segment is treated as a standalone text unit, allowing comparison between context-rich and context-reduced extraction outcomes.</w:t>
-      </w:r>
-    </w:p>
-    <w:p>
-      <w:pPr>
-        <w:pStyle w:val="berschrift3"/>
-        <w:rPr>
-          <w:lang w:val="en-GB"/>
-        </w:rPr>
-      </w:pPr>
-      <w:r>
-        <w:rPr>
-          <w:lang w:val="en-GB"/>
+          <w:b/>
+          <w:bCs/>
         </w:rPr>
         <w:t>Cross-validation</w:t>
       </w:r>
     </w:p>
     <w:p>
+      <w:r>
+        <w:t>The extracted outputs are evaluated through comparison with manually coded recommendation and solution passages. Comparisons focus on document-level coverage, the prevalence of recommendations and policy options, overlap between manually and automatically identified passages, and agreement in structured extraction outputs.</w:t>
+      </w:r>
+    </w:p>
+    <w:p>
+      <w:r>
+        <w:lastRenderedPageBreak/>
+        <w:t>The dual-source design additionally enables comparison between recommendation passages identified through different extraction routes, while the context-comparison analysis evaluates the extent to which extracted attributes change when the same policy-relevant content is analysed within a complete-document context versus an isolated passage context. Together, these procedures provide evidence regarding both extraction validity and contextual robustness.</w:t>
+      </w:r>
+    </w:p>
+    <w:p>
       <w:pPr>
         <w:rPr>
-          <w:lang w:val="en-GB"/>
+          <w:b/>
+          <w:bCs/>
         </w:rPr>
       </w:pPr>
       <w:r>
         <w:rPr>
-          <w:lang w:val="en-GB"/>
-        </w:rPr>
-        <w:t>The extracted outputs are evaluated through comparison with manually coded data. The primary comparison examines whether the AI and manual approaches agree on the presence and type of solutions within documents, as well as on the distribution of recommendations versus policy options. The dual-pass design further allows evaluation of how extraction results change when moving from full-document context to isolated solution segments, providing insight into the robustness of the extraction logic.</w:t>
-      </w:r>
-    </w:p>
-    <w:p>
-      <w:pPr>
-        <w:pStyle w:val="berschrift3"/>
-        <w:rPr>
-          <w:lang w:val="en-GB"/>
-        </w:rPr>
-      </w:pPr>
-      <w:r>
-        <w:rPr>
-          <w:lang w:val="en-GB"/>
+          <w:b/>
+          <w:bCs/>
         </w:rPr>
         <w:t>Output and post-processing</w:t>
       </w:r>
     </w:p>
     <w:p>
-      <w:pPr>
-        <w:rPr>
-          <w:lang w:val="en-GB"/>
-        </w:rPr>
-      </w:pPr>
-      <w:r>
-        <w:rPr>
-          <w:lang w:val="en-GB"/>
-        </w:rPr>
-        <w:t>The pipeline produces structured tabular outputs for each document and extraction type, along with detailed audit records capturing intermediate results and processing diagnostics. Extracted items are standardized, deduplicated, and linked to their source text to ensure traceability.</w:t>
-      </w:r>
-      <w:r>
-        <w:rPr>
-          <w:lang w:val="en-GB"/>
-        </w:rPr>
-        <w:t xml:space="preserve"> </w:t>
-      </w:r>
-      <w:r>
-        <w:rPr>
-          <w:lang w:val="en-GB"/>
-        </w:rPr>
-        <w:t xml:space="preserve">These outputs can be directly used for quantitative analysis while retaining transparent </w:t>
-      </w:r>
-      <w:r>
-        <w:rPr>
-          <w:lang w:val="en-GB"/>
-        </w:rPr>
-        <w:t xml:space="preserve">and auditable </w:t>
-      </w:r>
-      <w:r>
-        <w:rPr>
-          <w:lang w:val="en-GB"/>
-        </w:rPr>
-        <w:t>links to the underlying textual evidence.</w:t>
-      </w:r>
-    </w:p>
+      <w:r>
+        <w:t>The pipeline produces separate outputs for document-level analyses, policy-extraction results, recommendation-level analyses, human-identified recommendation passages, validation procedures, and audit records. Structured outputs are stored in tabular form, while detailed audit files capture intermediate results and processing diagnostics.</w:t>
+      </w:r>
+    </w:p>
+    <w:p>
+      <w:r>
+        <w:t>All extracted items are standardized, deduplicated, and linked to their source text to ensure traceability. Outputs additionally retain explicit provenance information, indicating whether findings originate from complete policy briefs, LLM-identified recommendation passages, or human-identified recommendation passages. This architecture allows direct use of the outputs in quantitative analysis while maintaining transparent and auditable links to the underlying textual evidence.</w:t>
+      </w:r>
+    </w:p>
+    <w:p/>
     <w:sectPr>
       <w:pgSz w:w="11906" w:h="16838"/>
       <w:pgMar w:top="1440" w:right="1440" w:bottom="1440" w:left="1440" w:header="708" w:footer="708" w:gutter="0"/>
@@ -587,6 +342,359 @@
     </w:sectPr>
   </w:body>
 </w:document>
+</file>
+
+<file path=word/numbering.xml><?xml version="1.0" encoding="utf-8"?>
+<w:numbering xmlns:wpc="http://schemas.microsoft.com/office/word/2010/wordprocessingCanvas" xmlns:cx="http://schemas.microsoft.com/office/drawing/2014/chartex" xmlns:cx1="http://schemas.microsoft.com/office/drawing/2015/9/8/chartex" xmlns:cx2="http://schemas.microsoft.com/office/drawing/2015/10/21/chartex" xmlns:cx3="http://schemas.microsoft.com/office/drawing/2016/5/9/chartex" xmlns:cx4="http://schemas.microsoft.com/office/drawing/2016/5/10/chartex" xmlns:cx5="http://schemas.microsoft.com/office/drawing/2016/5/11/chartex" xmlns:cx6="http://schemas.microsoft.com/office/drawing/2016/5/12/chartex" xmlns:cx7="http://schemas.microsoft.com/office/drawing/2016/5/13/chartex" xmlns:cx8="http://schemas.microsoft.com/office/drawing/2016/5/14/chartex" xmlns:mc="http://schemas.openxmlformats.org/markup-compatibility/2006" xmlns:aink="http://schemas.microsoft.com/office/drawing/2016/ink" xmlns:am3d="http://schemas.microsoft.com/office/drawing/2017/model3d" xmlns:o="urn:schemas-microsoft-com:office:office" xmlns:oel="http://schemas.microsoft.com/office/2019/extlst" xmlns:r="http://schemas.openxmlformats.org/officeDocument/2006/relationships" xmlns:m="http://schemas.openxmlformats.org/officeDocument/2006/math" xmlns:v="urn:schemas-microsoft-com:vml" xmlns:wp14="http://schemas.microsoft.com/office/word/2010/wordprocessingDrawing" xmlns:wp="http://schemas.openxmlformats.org/drawingml/2006/wordprocessingDrawing" xmlns:w10="urn:schemas-microsoft-com:office:word" xmlns:w="http://schemas.openxmlformats.org/wordprocessingml/2006/main" xmlns:w14="http://schemas.microsoft.com/office/word/2010/wordml" xmlns:w15="http://schemas.microsoft.com/office/word/2012/wordml" xmlns:w16cex="http://schemas.microsoft.com/office/word/2018/wordml/cex" xmlns:w16cid="http://schemas.microsoft.com/office/word/2016/wordml/cid" xmlns:w16="http://schemas.microsoft.com/office/word/2018/wordml" xmlns:w16du="http://schemas.microsoft.com/office/word/2023/wordml/word16du" xmlns:w16sdtdh="http://schemas.microsoft.com/office/word/2020/wordml/sdtdatahash" xmlns:w16sdtfl="http://schemas.microsoft.com/office/word/2024/wordml/sdtformatlock" xmlns:w16se="http://schemas.microsoft.com/office/word/2015/wordml/symex" xmlns:wpg="http://schemas.microsoft.com/office/word/2010/wordprocessingGroup" xmlns:wpi="http://schemas.microsoft.com/office/word/2010/wordprocessingInk" xmlns:wne="http://schemas.microsoft.com/office/word/2006/wordml" xmlns:wps="http://schemas.microsoft.com/office/word/2010/wordprocessingShape" mc:Ignorable="w14 w15 w16se w16cid w16 w16cex w16sdtdh w16sdtfl w16du wp14">
+  <w:abstractNum w:abstractNumId="0" w15:restartNumberingAfterBreak="0">
+    <w:nsid w:val="00322A48"/>
+    <w:multiLevelType w:val="multilevel"/>
+    <w:tmpl w:val="A326985A"/>
+    <w:lvl w:ilvl="0">
+      <w:start w:val="1"/>
+      <w:numFmt w:val="decimal"/>
+      <w:lvlText w:val="%1."/>
+      <w:lvlJc w:val="left"/>
+      <w:pPr>
+        <w:tabs>
+          <w:tab w:val="num" w:pos="720"/>
+        </w:tabs>
+        <w:ind w:left="720" w:hanging="360"/>
+      </w:pPr>
+    </w:lvl>
+    <w:lvl w:ilvl="1" w:tentative="1">
+      <w:start w:val="1"/>
+      <w:numFmt w:val="decimal"/>
+      <w:lvlText w:val="%2."/>
+      <w:lvlJc w:val="left"/>
+      <w:pPr>
+        <w:tabs>
+          <w:tab w:val="num" w:pos="1440"/>
+        </w:tabs>
+        <w:ind w:left="1440" w:hanging="360"/>
+      </w:pPr>
+    </w:lvl>
+    <w:lvl w:ilvl="2" w:tentative="1">
+      <w:start w:val="1"/>
+      <w:numFmt w:val="decimal"/>
+      <w:lvlText w:val="%3."/>
+      <w:lvlJc w:val="left"/>
+      <w:pPr>
+        <w:tabs>
+          <w:tab w:val="num" w:pos="2160"/>
+        </w:tabs>
+        <w:ind w:left="2160" w:hanging="360"/>
+      </w:pPr>
+    </w:lvl>
+    <w:lvl w:ilvl="3" w:tentative="1">
+      <w:start w:val="1"/>
+      <w:numFmt w:val="decimal"/>
+      <w:lvlText w:val="%4."/>
+      <w:lvlJc w:val="left"/>
+      <w:pPr>
+        <w:tabs>
+          <w:tab w:val="num" w:pos="2880"/>
+        </w:tabs>
+        <w:ind w:left="2880" w:hanging="360"/>
+      </w:pPr>
+    </w:lvl>
+    <w:lvl w:ilvl="4" w:tentative="1">
+      <w:start w:val="1"/>
+      <w:numFmt w:val="decimal"/>
+      <w:lvlText w:val="%5."/>
+      <w:lvlJc w:val="left"/>
+      <w:pPr>
+        <w:tabs>
+          <w:tab w:val="num" w:pos="3600"/>
+        </w:tabs>
+        <w:ind w:left="3600" w:hanging="360"/>
+      </w:pPr>
+    </w:lvl>
+    <w:lvl w:ilvl="5" w:tentative="1">
+      <w:start w:val="1"/>
+      <w:numFmt w:val="decimal"/>
+      <w:lvlText w:val="%6."/>
+      <w:lvlJc w:val="left"/>
+      <w:pPr>
+        <w:tabs>
+          <w:tab w:val="num" w:pos="4320"/>
+        </w:tabs>
+        <w:ind w:left="4320" w:hanging="360"/>
+      </w:pPr>
+    </w:lvl>
+    <w:lvl w:ilvl="6" w:tentative="1">
+      <w:start w:val="1"/>
+      <w:numFmt w:val="decimal"/>
+      <w:lvlText w:val="%7."/>
+      <w:lvlJc w:val="left"/>
+      <w:pPr>
+        <w:tabs>
+          <w:tab w:val="num" w:pos="5040"/>
+        </w:tabs>
+        <w:ind w:left="5040" w:hanging="360"/>
+      </w:pPr>
+    </w:lvl>
+    <w:lvl w:ilvl="7" w:tentative="1">
+      <w:start w:val="1"/>
+      <w:numFmt w:val="decimal"/>
+      <w:lvlText w:val="%8."/>
+      <w:lvlJc w:val="left"/>
+      <w:pPr>
+        <w:tabs>
+          <w:tab w:val="num" w:pos="5760"/>
+        </w:tabs>
+        <w:ind w:left="5760" w:hanging="360"/>
+      </w:pPr>
+    </w:lvl>
+    <w:lvl w:ilvl="8" w:tentative="1">
+      <w:start w:val="1"/>
+      <w:numFmt w:val="decimal"/>
+      <w:lvlText w:val="%9."/>
+      <w:lvlJc w:val="left"/>
+      <w:pPr>
+        <w:tabs>
+          <w:tab w:val="num" w:pos="6480"/>
+        </w:tabs>
+        <w:ind w:left="6480" w:hanging="360"/>
+      </w:pPr>
+    </w:lvl>
+  </w:abstractNum>
+  <w:abstractNum w:abstractNumId="1" w15:restartNumberingAfterBreak="0">
+    <w:nsid w:val="560A72CE"/>
+    <w:multiLevelType w:val="multilevel"/>
+    <w:tmpl w:val="1CBA6F66"/>
+    <w:lvl w:ilvl="0">
+      <w:start w:val="1"/>
+      <w:numFmt w:val="decimal"/>
+      <w:lvlText w:val="%1."/>
+      <w:lvlJc w:val="left"/>
+      <w:pPr>
+        <w:tabs>
+          <w:tab w:val="num" w:pos="720"/>
+        </w:tabs>
+        <w:ind w:left="720" w:hanging="360"/>
+      </w:pPr>
+    </w:lvl>
+    <w:lvl w:ilvl="1" w:tentative="1">
+      <w:start w:val="1"/>
+      <w:numFmt w:val="decimal"/>
+      <w:lvlText w:val="%2."/>
+      <w:lvlJc w:val="left"/>
+      <w:pPr>
+        <w:tabs>
+          <w:tab w:val="num" w:pos="1440"/>
+        </w:tabs>
+        <w:ind w:left="1440" w:hanging="360"/>
+      </w:pPr>
+    </w:lvl>
+    <w:lvl w:ilvl="2" w:tentative="1">
+      <w:start w:val="1"/>
+      <w:numFmt w:val="decimal"/>
+      <w:lvlText w:val="%3."/>
+      <w:lvlJc w:val="left"/>
+      <w:pPr>
+        <w:tabs>
+          <w:tab w:val="num" w:pos="2160"/>
+        </w:tabs>
+        <w:ind w:left="2160" w:hanging="360"/>
+      </w:pPr>
+    </w:lvl>
+    <w:lvl w:ilvl="3" w:tentative="1">
+      <w:start w:val="1"/>
+      <w:numFmt w:val="decimal"/>
+      <w:lvlText w:val="%4."/>
+      <w:lvlJc w:val="left"/>
+      <w:pPr>
+        <w:tabs>
+          <w:tab w:val="num" w:pos="2880"/>
+        </w:tabs>
+        <w:ind w:left="2880" w:hanging="360"/>
+      </w:pPr>
+    </w:lvl>
+    <w:lvl w:ilvl="4" w:tentative="1">
+      <w:start w:val="1"/>
+      <w:numFmt w:val="decimal"/>
+      <w:lvlText w:val="%5."/>
+      <w:lvlJc w:val="left"/>
+      <w:pPr>
+        <w:tabs>
+          <w:tab w:val="num" w:pos="3600"/>
+        </w:tabs>
+        <w:ind w:left="3600" w:hanging="360"/>
+      </w:pPr>
+    </w:lvl>
+    <w:lvl w:ilvl="5" w:tentative="1">
+      <w:start w:val="1"/>
+      <w:numFmt w:val="decimal"/>
+      <w:lvlText w:val="%6."/>
+      <w:lvlJc w:val="left"/>
+      <w:pPr>
+        <w:tabs>
+          <w:tab w:val="num" w:pos="4320"/>
+        </w:tabs>
+        <w:ind w:left="4320" w:hanging="360"/>
+      </w:pPr>
+    </w:lvl>
+    <w:lvl w:ilvl="6" w:tentative="1">
+      <w:start w:val="1"/>
+      <w:numFmt w:val="decimal"/>
+      <w:lvlText w:val="%7."/>
+      <w:lvlJc w:val="left"/>
+      <w:pPr>
+        <w:tabs>
+          <w:tab w:val="num" w:pos="5040"/>
+        </w:tabs>
+        <w:ind w:left="5040" w:hanging="360"/>
+      </w:pPr>
+    </w:lvl>
+    <w:lvl w:ilvl="7" w:tentative="1">
+      <w:start w:val="1"/>
+      <w:numFmt w:val="decimal"/>
+      <w:lvlText w:val="%8."/>
+      <w:lvlJc w:val="left"/>
+      <w:pPr>
+        <w:tabs>
+          <w:tab w:val="num" w:pos="5760"/>
+        </w:tabs>
+        <w:ind w:left="5760" w:hanging="360"/>
+      </w:pPr>
+    </w:lvl>
+    <w:lvl w:ilvl="8" w:tentative="1">
+      <w:start w:val="1"/>
+      <w:numFmt w:val="decimal"/>
+      <w:lvlText w:val="%9."/>
+      <w:lvlJc w:val="left"/>
+      <w:pPr>
+        <w:tabs>
+          <w:tab w:val="num" w:pos="6480"/>
+        </w:tabs>
+        <w:ind w:left="6480" w:hanging="360"/>
+      </w:pPr>
+    </w:lvl>
+  </w:abstractNum>
+  <w:abstractNum w:abstractNumId="2" w15:restartNumberingAfterBreak="0">
+    <w:nsid w:val="6ACB4A77"/>
+    <w:multiLevelType w:val="multilevel"/>
+    <w:tmpl w:val="E6446256"/>
+    <w:lvl w:ilvl="0">
+      <w:start w:val="1"/>
+      <w:numFmt w:val="decimal"/>
+      <w:lvlText w:val="%1."/>
+      <w:lvlJc w:val="left"/>
+      <w:pPr>
+        <w:tabs>
+          <w:tab w:val="num" w:pos="720"/>
+        </w:tabs>
+        <w:ind w:left="720" w:hanging="360"/>
+      </w:pPr>
+    </w:lvl>
+    <w:lvl w:ilvl="1" w:tentative="1">
+      <w:start w:val="1"/>
+      <w:numFmt w:val="decimal"/>
+      <w:lvlText w:val="%2."/>
+      <w:lvlJc w:val="left"/>
+      <w:pPr>
+        <w:tabs>
+          <w:tab w:val="num" w:pos="1440"/>
+        </w:tabs>
+        <w:ind w:left="1440" w:hanging="360"/>
+      </w:pPr>
+    </w:lvl>
+    <w:lvl w:ilvl="2" w:tentative="1">
+      <w:start w:val="1"/>
+      <w:numFmt w:val="decimal"/>
+      <w:lvlText w:val="%3."/>
+      <w:lvlJc w:val="left"/>
+      <w:pPr>
+        <w:tabs>
+          <w:tab w:val="num" w:pos="2160"/>
+        </w:tabs>
+        <w:ind w:left="2160" w:hanging="360"/>
+      </w:pPr>
+    </w:lvl>
+    <w:lvl w:ilvl="3" w:tentative="1">
+      <w:start w:val="1"/>
+      <w:numFmt w:val="decimal"/>
+      <w:lvlText w:val="%4."/>
+      <w:lvlJc w:val="left"/>
+      <w:pPr>
+        <w:tabs>
+          <w:tab w:val="num" w:pos="2880"/>
+        </w:tabs>
+        <w:ind w:left="2880" w:hanging="360"/>
+      </w:pPr>
+    </w:lvl>
+    <w:lvl w:ilvl="4" w:tentative="1">
+      <w:start w:val="1"/>
+      <w:numFmt w:val="decimal"/>
+      <w:lvlText w:val="%5."/>
+      <w:lvlJc w:val="left"/>
+      <w:pPr>
+        <w:tabs>
+          <w:tab w:val="num" w:pos="3600"/>
+        </w:tabs>
+        <w:ind w:left="3600" w:hanging="360"/>
+      </w:pPr>
+    </w:lvl>
+    <w:lvl w:ilvl="5" w:tentative="1">
+      <w:start w:val="1"/>
+      <w:numFmt w:val="decimal"/>
+      <w:lvlText w:val="%6."/>
+      <w:lvlJc w:val="left"/>
+      <w:pPr>
+        <w:tabs>
+          <w:tab w:val="num" w:pos="4320"/>
+        </w:tabs>
+        <w:ind w:left="4320" w:hanging="360"/>
+      </w:pPr>
+    </w:lvl>
+    <w:lvl w:ilvl="6" w:tentative="1">
+      <w:start w:val="1"/>
+      <w:numFmt w:val="decimal"/>
+      <w:lvlText w:val="%7."/>
+      <w:lvlJc w:val="left"/>
+      <w:pPr>
+        <w:tabs>
+          <w:tab w:val="num" w:pos="5040"/>
+        </w:tabs>
+        <w:ind w:left="5040" w:hanging="360"/>
+      </w:pPr>
+    </w:lvl>
+    <w:lvl w:ilvl="7" w:tentative="1">
+      <w:start w:val="1"/>
+      <w:numFmt w:val="decimal"/>
+      <w:lvlText w:val="%8."/>
+      <w:lvlJc w:val="left"/>
+      <w:pPr>
+        <w:tabs>
+          <w:tab w:val="num" w:pos="5760"/>
+        </w:tabs>
+        <w:ind w:left="5760" w:hanging="360"/>
+      </w:pPr>
+    </w:lvl>
+    <w:lvl w:ilvl="8" w:tentative="1">
+      <w:start w:val="1"/>
+      <w:numFmt w:val="decimal"/>
+      <w:lvlText w:val="%9."/>
+      <w:lvlJc w:val="left"/>
+      <w:pPr>
+        <w:tabs>
+          <w:tab w:val="num" w:pos="6480"/>
+        </w:tabs>
+        <w:ind w:left="6480" w:hanging="360"/>
+      </w:pPr>
+    </w:lvl>
+  </w:abstractNum>
+  <w:num w:numId="1" w16cid:durableId="573048534">
+    <w:abstractNumId w:val="0"/>
+  </w:num>
+  <w:num w:numId="2" w16cid:durableId="18703393">
+    <w:abstractNumId w:val="2"/>
+  </w:num>
+  <w:num w:numId="3" w16cid:durableId="169830177">
+    <w:abstractNumId w:val="1"/>
+  </w:num>
+</w:numbering>
 </file>
 
 <file path=word/styles.xml><?xml version="1.0" encoding="utf-8"?>
@@ -598,7 +706,7 @@
         <w:kern w:val="2"/>
         <w:sz w:val="24"/>
         <w:szCs w:val="24"/>
-        <w:lang w:eastAsia="en-US" w:bidi="ar-SA"/>
+        <w:lang w:val="en-DE" w:eastAsia="en-US" w:bidi="ar-SA"/>
         <w14:ligatures w14:val="standardContextual"/>
       </w:rPr>
     </w:rPrDefault>
@@ -986,15 +1094,15 @@
     <w:lsdException w:name="Unresolved Mention" w:semiHidden="1" w:unhideWhenUsed="1"/>
     <w:lsdException w:name="Smart Link" w:semiHidden="1" w:unhideWhenUsed="1"/>
   </w:latentStyles>
-  <w:style w:type="paragraph" w:default="1" w:styleId="Standard">
+  <w:style w:type="paragraph" w:default="1" w:styleId="Normal">
     <w:name w:val="Normal"/>
     <w:qFormat/>
   </w:style>
-  <w:style w:type="paragraph" w:styleId="berschrift1">
+  <w:style w:type="paragraph" w:styleId="Heading1">
     <w:name w:val="heading 1"/>
-    <w:basedOn w:val="Standard"/>
-    <w:next w:val="Standard"/>
-    <w:link w:val="berschrift1Zchn"/>
+    <w:basedOn w:val="Normal"/>
+    <w:next w:val="Normal"/>
+    <w:link w:val="Heading1Char"/>
     <w:uiPriority w:val="9"/>
     <w:qFormat/>
     <w:rsid w:val="00CD16AB"/>
@@ -1011,11 +1119,11 @@
       <w:szCs w:val="40"/>
     </w:rPr>
   </w:style>
-  <w:style w:type="paragraph" w:styleId="berschrift2">
+  <w:style w:type="paragraph" w:styleId="Heading2">
     <w:name w:val="heading 2"/>
-    <w:basedOn w:val="Standard"/>
-    <w:next w:val="Standard"/>
-    <w:link w:val="berschrift2Zchn"/>
+    <w:basedOn w:val="Normal"/>
+    <w:next w:val="Normal"/>
+    <w:link w:val="Heading2Char"/>
     <w:uiPriority w:val="9"/>
     <w:unhideWhenUsed/>
     <w:qFormat/>
@@ -1033,11 +1141,11 @@
       <w:szCs w:val="32"/>
     </w:rPr>
   </w:style>
-  <w:style w:type="paragraph" w:styleId="berschrift3">
+  <w:style w:type="paragraph" w:styleId="Heading3">
     <w:name w:val="heading 3"/>
-    <w:basedOn w:val="Standard"/>
-    <w:next w:val="Standard"/>
-    <w:link w:val="berschrift3Zchn"/>
+    <w:basedOn w:val="Normal"/>
+    <w:next w:val="Normal"/>
+    <w:link w:val="Heading3Char"/>
     <w:uiPriority w:val="9"/>
     <w:unhideWhenUsed/>
     <w:qFormat/>
@@ -1055,11 +1163,11 @@
       <w:szCs w:val="28"/>
     </w:rPr>
   </w:style>
-  <w:style w:type="paragraph" w:styleId="berschrift4">
+  <w:style w:type="paragraph" w:styleId="Heading4">
     <w:name w:val="heading 4"/>
-    <w:basedOn w:val="Standard"/>
-    <w:next w:val="Standard"/>
-    <w:link w:val="berschrift4Zchn"/>
+    <w:basedOn w:val="Normal"/>
+    <w:next w:val="Normal"/>
+    <w:link w:val="Heading4Char"/>
     <w:uiPriority w:val="9"/>
     <w:semiHidden/>
     <w:unhideWhenUsed/>
@@ -1078,11 +1186,11 @@
       <w:color w:val="0F4761" w:themeColor="accent1" w:themeShade="BF"/>
     </w:rPr>
   </w:style>
-  <w:style w:type="paragraph" w:styleId="berschrift5">
+  <w:style w:type="paragraph" w:styleId="Heading5">
     <w:name w:val="heading 5"/>
-    <w:basedOn w:val="Standard"/>
-    <w:next w:val="Standard"/>
-    <w:link w:val="berschrift5Zchn"/>
+    <w:basedOn w:val="Normal"/>
+    <w:next w:val="Normal"/>
+    <w:link w:val="Heading5Char"/>
     <w:uiPriority w:val="9"/>
     <w:semiHidden/>
     <w:unhideWhenUsed/>
@@ -1099,11 +1207,11 @@
       <w:color w:val="0F4761" w:themeColor="accent1" w:themeShade="BF"/>
     </w:rPr>
   </w:style>
-  <w:style w:type="paragraph" w:styleId="berschrift6">
+  <w:style w:type="paragraph" w:styleId="Heading6">
     <w:name w:val="heading 6"/>
-    <w:basedOn w:val="Standard"/>
-    <w:next w:val="Standard"/>
-    <w:link w:val="berschrift6Zchn"/>
+    <w:basedOn w:val="Normal"/>
+    <w:next w:val="Normal"/>
+    <w:link w:val="Heading6Char"/>
     <w:uiPriority w:val="9"/>
     <w:semiHidden/>
     <w:unhideWhenUsed/>
@@ -1122,11 +1230,11 @@
       <w:color w:val="595959" w:themeColor="text1" w:themeTint="A6"/>
     </w:rPr>
   </w:style>
-  <w:style w:type="paragraph" w:styleId="berschrift7">
+  <w:style w:type="paragraph" w:styleId="Heading7">
     <w:name w:val="heading 7"/>
-    <w:basedOn w:val="Standard"/>
-    <w:next w:val="Standard"/>
-    <w:link w:val="berschrift7Zchn"/>
+    <w:basedOn w:val="Normal"/>
+    <w:next w:val="Normal"/>
+    <w:link w:val="Heading7Char"/>
     <w:uiPriority w:val="9"/>
     <w:semiHidden/>
     <w:unhideWhenUsed/>
@@ -1143,11 +1251,11 @@
       <w:color w:val="595959" w:themeColor="text1" w:themeTint="A6"/>
     </w:rPr>
   </w:style>
-  <w:style w:type="paragraph" w:styleId="berschrift8">
+  <w:style w:type="paragraph" w:styleId="Heading8">
     <w:name w:val="heading 8"/>
-    <w:basedOn w:val="Standard"/>
-    <w:next w:val="Standard"/>
-    <w:link w:val="berschrift8Zchn"/>
+    <w:basedOn w:val="Normal"/>
+    <w:next w:val="Normal"/>
+    <w:link w:val="Heading8Char"/>
     <w:uiPriority w:val="9"/>
     <w:semiHidden/>
     <w:unhideWhenUsed/>
@@ -1166,11 +1274,11 @@
       <w:color w:val="272727" w:themeColor="text1" w:themeTint="D8"/>
     </w:rPr>
   </w:style>
-  <w:style w:type="paragraph" w:styleId="berschrift9">
+  <w:style w:type="paragraph" w:styleId="Heading9">
     <w:name w:val="heading 9"/>
-    <w:basedOn w:val="Standard"/>
-    <w:next w:val="Standard"/>
-    <w:link w:val="berschrift9Zchn"/>
+    <w:basedOn w:val="Normal"/>
+    <w:next w:val="Normal"/>
+    <w:link w:val="Heading9Char"/>
     <w:uiPriority w:val="9"/>
     <w:semiHidden/>
     <w:unhideWhenUsed/>
@@ -1187,12 +1295,12 @@
       <w:color w:val="272727" w:themeColor="text1" w:themeTint="D8"/>
     </w:rPr>
   </w:style>
-  <w:style w:type="character" w:default="1" w:styleId="Absatz-Standardschriftart">
+  <w:style w:type="character" w:default="1" w:styleId="DefaultParagraphFont">
     <w:name w:val="Default Paragraph Font"/>
     <w:uiPriority w:val="1"/>
     <w:unhideWhenUsed/>
   </w:style>
-  <w:style w:type="table" w:default="1" w:styleId="NormaleTabelle">
+  <w:style w:type="table" w:default="1" w:styleId="TableNormal">
     <w:name w:val="Normal Table"/>
     <w:uiPriority w:val="99"/>
     <w:semiHidden/>
@@ -1207,16 +1315,16 @@
       </w:tblCellMar>
     </w:tblPr>
   </w:style>
-  <w:style w:type="numbering" w:default="1" w:styleId="KeineListe">
+  <w:style w:type="numbering" w:default="1" w:styleId="NoList">
     <w:name w:val="No List"/>
     <w:uiPriority w:val="99"/>
     <w:semiHidden/>
     <w:unhideWhenUsed/>
   </w:style>
-  <w:style w:type="character" w:customStyle="1" w:styleId="berschrift1Zchn">
-    <w:name w:val="Überschrift 1 Zchn"/>
-    <w:basedOn w:val="Absatz-Standardschriftart"/>
-    <w:link w:val="berschrift1"/>
+  <w:style w:type="character" w:customStyle="1" w:styleId="Heading1Char">
+    <w:name w:val="Heading 1 Char"/>
+    <w:basedOn w:val="DefaultParagraphFont"/>
+    <w:link w:val="Heading1"/>
     <w:uiPriority w:val="9"/>
     <w:rsid w:val="00CD16AB"/>
     <w:rPr>
@@ -1226,10 +1334,10 @@
       <w:szCs w:val="40"/>
     </w:rPr>
   </w:style>
-  <w:style w:type="character" w:customStyle="1" w:styleId="berschrift2Zchn">
-    <w:name w:val="Überschrift 2 Zchn"/>
-    <w:basedOn w:val="Absatz-Standardschriftart"/>
-    <w:link w:val="berschrift2"/>
+  <w:style w:type="character" w:customStyle="1" w:styleId="Heading2Char">
+    <w:name w:val="Heading 2 Char"/>
+    <w:basedOn w:val="DefaultParagraphFont"/>
+    <w:link w:val="Heading2"/>
     <w:uiPriority w:val="9"/>
     <w:rsid w:val="00CD16AB"/>
     <w:rPr>
@@ -1239,10 +1347,10 @@
       <w:szCs w:val="32"/>
     </w:rPr>
   </w:style>
-  <w:style w:type="character" w:customStyle="1" w:styleId="berschrift3Zchn">
-    <w:name w:val="Überschrift 3 Zchn"/>
-    <w:basedOn w:val="Absatz-Standardschriftart"/>
-    <w:link w:val="berschrift3"/>
+  <w:style w:type="character" w:customStyle="1" w:styleId="Heading3Char">
+    <w:name w:val="Heading 3 Char"/>
+    <w:basedOn w:val="DefaultParagraphFont"/>
+    <w:link w:val="Heading3"/>
     <w:uiPriority w:val="9"/>
     <w:rsid w:val="00CD16AB"/>
     <w:rPr>
@@ -1252,10 +1360,10 @@
       <w:szCs w:val="28"/>
     </w:rPr>
   </w:style>
-  <w:style w:type="character" w:customStyle="1" w:styleId="berschrift4Zchn">
-    <w:name w:val="Überschrift 4 Zchn"/>
-    <w:basedOn w:val="Absatz-Standardschriftart"/>
-    <w:link w:val="berschrift4"/>
+  <w:style w:type="character" w:customStyle="1" w:styleId="Heading4Char">
+    <w:name w:val="Heading 4 Char"/>
+    <w:basedOn w:val="DefaultParagraphFont"/>
+    <w:link w:val="Heading4"/>
     <w:uiPriority w:val="9"/>
     <w:semiHidden/>
     <w:rsid w:val="00CD16AB"/>
@@ -1266,10 +1374,10 @@
       <w:color w:val="0F4761" w:themeColor="accent1" w:themeShade="BF"/>
     </w:rPr>
   </w:style>
-  <w:style w:type="character" w:customStyle="1" w:styleId="berschrift5Zchn">
-    <w:name w:val="Überschrift 5 Zchn"/>
-    <w:basedOn w:val="Absatz-Standardschriftart"/>
-    <w:link w:val="berschrift5"/>
+  <w:style w:type="character" w:customStyle="1" w:styleId="Heading5Char">
+    <w:name w:val="Heading 5 Char"/>
+    <w:basedOn w:val="DefaultParagraphFont"/>
+    <w:link w:val="Heading5"/>
     <w:uiPriority w:val="9"/>
     <w:semiHidden/>
     <w:rsid w:val="00CD16AB"/>
@@ -1278,10 +1386,10 @@
       <w:color w:val="0F4761" w:themeColor="accent1" w:themeShade="BF"/>
     </w:rPr>
   </w:style>
-  <w:style w:type="character" w:customStyle="1" w:styleId="berschrift6Zchn">
-    <w:name w:val="Überschrift 6 Zchn"/>
-    <w:basedOn w:val="Absatz-Standardschriftart"/>
-    <w:link w:val="berschrift6"/>
+  <w:style w:type="character" w:customStyle="1" w:styleId="Heading6Char">
+    <w:name w:val="Heading 6 Char"/>
+    <w:basedOn w:val="DefaultParagraphFont"/>
+    <w:link w:val="Heading6"/>
     <w:uiPriority w:val="9"/>
     <w:semiHidden/>
     <w:rsid w:val="00CD16AB"/>
@@ -1292,10 +1400,10 @@
       <w:color w:val="595959" w:themeColor="text1" w:themeTint="A6"/>
     </w:rPr>
   </w:style>
-  <w:style w:type="character" w:customStyle="1" w:styleId="berschrift7Zchn">
-    <w:name w:val="Überschrift 7 Zchn"/>
-    <w:basedOn w:val="Absatz-Standardschriftart"/>
-    <w:link w:val="berschrift7"/>
+  <w:style w:type="character" w:customStyle="1" w:styleId="Heading7Char">
+    <w:name w:val="Heading 7 Char"/>
+    <w:basedOn w:val="DefaultParagraphFont"/>
+    <w:link w:val="Heading7"/>
     <w:uiPriority w:val="9"/>
     <w:semiHidden/>
     <w:rsid w:val="00CD16AB"/>
@@ -1304,10 +1412,10 @@
       <w:color w:val="595959" w:themeColor="text1" w:themeTint="A6"/>
     </w:rPr>
   </w:style>
-  <w:style w:type="character" w:customStyle="1" w:styleId="berschrift8Zchn">
-    <w:name w:val="Überschrift 8 Zchn"/>
-    <w:basedOn w:val="Absatz-Standardschriftart"/>
-    <w:link w:val="berschrift8"/>
+  <w:style w:type="character" w:customStyle="1" w:styleId="Heading8Char">
+    <w:name w:val="Heading 8 Char"/>
+    <w:basedOn w:val="DefaultParagraphFont"/>
+    <w:link w:val="Heading8"/>
     <w:uiPriority w:val="9"/>
     <w:semiHidden/>
     <w:rsid w:val="00CD16AB"/>
@@ -1318,10 +1426,10 @@
       <w:color w:val="272727" w:themeColor="text1" w:themeTint="D8"/>
     </w:rPr>
   </w:style>
-  <w:style w:type="character" w:customStyle="1" w:styleId="berschrift9Zchn">
-    <w:name w:val="Überschrift 9 Zchn"/>
-    <w:basedOn w:val="Absatz-Standardschriftart"/>
-    <w:link w:val="berschrift9"/>
+  <w:style w:type="character" w:customStyle="1" w:styleId="Heading9Char">
+    <w:name w:val="Heading 9 Char"/>
+    <w:basedOn w:val="DefaultParagraphFont"/>
+    <w:link w:val="Heading9"/>
     <w:uiPriority w:val="9"/>
     <w:semiHidden/>
     <w:rsid w:val="00CD16AB"/>
@@ -1330,11 +1438,11 @@
       <w:color w:val="272727" w:themeColor="text1" w:themeTint="D8"/>
     </w:rPr>
   </w:style>
-  <w:style w:type="paragraph" w:styleId="Titel">
+  <w:style w:type="paragraph" w:styleId="Title">
     <w:name w:val="Title"/>
-    <w:basedOn w:val="Standard"/>
-    <w:next w:val="Standard"/>
-    <w:link w:val="TitelZchn"/>
+    <w:basedOn w:val="Normal"/>
+    <w:next w:val="Normal"/>
+    <w:link w:val="TitleChar"/>
     <w:uiPriority w:val="10"/>
     <w:qFormat/>
     <w:rsid w:val="00CD16AB"/>
@@ -1350,10 +1458,10 @@
       <w:szCs w:val="56"/>
     </w:rPr>
   </w:style>
-  <w:style w:type="character" w:customStyle="1" w:styleId="TitelZchn">
-    <w:name w:val="Titel Zchn"/>
-    <w:basedOn w:val="Absatz-Standardschriftart"/>
-    <w:link w:val="Titel"/>
+  <w:style w:type="character" w:customStyle="1" w:styleId="TitleChar">
+    <w:name w:val="Title Char"/>
+    <w:basedOn w:val="DefaultParagraphFont"/>
+    <w:link w:val="Title"/>
     <w:uiPriority w:val="10"/>
     <w:rsid w:val="00CD16AB"/>
     <w:rPr>
@@ -1364,11 +1472,11 @@
       <w:szCs w:val="56"/>
     </w:rPr>
   </w:style>
-  <w:style w:type="paragraph" w:styleId="Untertitel">
+  <w:style w:type="paragraph" w:styleId="Subtitle">
     <w:name w:val="Subtitle"/>
-    <w:basedOn w:val="Standard"/>
-    <w:next w:val="Standard"/>
-    <w:link w:val="UntertitelZchn"/>
+    <w:basedOn w:val="Normal"/>
+    <w:next w:val="Normal"/>
+    <w:link w:val="SubtitleChar"/>
     <w:uiPriority w:val="11"/>
     <w:qFormat/>
     <w:rsid w:val="00CD16AB"/>
@@ -1385,10 +1493,10 @@
       <w:szCs w:val="28"/>
     </w:rPr>
   </w:style>
-  <w:style w:type="character" w:customStyle="1" w:styleId="UntertitelZchn">
-    <w:name w:val="Untertitel Zchn"/>
-    <w:basedOn w:val="Absatz-Standardschriftart"/>
-    <w:link w:val="Untertitel"/>
+  <w:style w:type="character" w:customStyle="1" w:styleId="SubtitleChar">
+    <w:name w:val="Subtitle Char"/>
+    <w:basedOn w:val="DefaultParagraphFont"/>
+    <w:link w:val="Subtitle"/>
     <w:uiPriority w:val="11"/>
     <w:rsid w:val="00CD16AB"/>
     <w:rPr>
@@ -1399,11 +1507,11 @@
       <w:szCs w:val="28"/>
     </w:rPr>
   </w:style>
-  <w:style w:type="paragraph" w:styleId="Zitat">
+  <w:style w:type="paragraph" w:styleId="Quote">
     <w:name w:val="Quote"/>
-    <w:basedOn w:val="Standard"/>
-    <w:next w:val="Standard"/>
-    <w:link w:val="ZitatZchn"/>
+    <w:basedOn w:val="Normal"/>
+    <w:next w:val="Normal"/>
+    <w:link w:val="QuoteChar"/>
     <w:uiPriority w:val="29"/>
     <w:qFormat/>
     <w:rsid w:val="00CD16AB"/>
@@ -1417,10 +1525,10 @@
       <w:color w:val="404040" w:themeColor="text1" w:themeTint="BF"/>
     </w:rPr>
   </w:style>
-  <w:style w:type="character" w:customStyle="1" w:styleId="ZitatZchn">
-    <w:name w:val="Zitat Zchn"/>
-    <w:basedOn w:val="Absatz-Standardschriftart"/>
-    <w:link w:val="Zitat"/>
+  <w:style w:type="character" w:customStyle="1" w:styleId="QuoteChar">
+    <w:name w:val="Quote Char"/>
+    <w:basedOn w:val="DefaultParagraphFont"/>
+    <w:link w:val="Quote"/>
     <w:uiPriority w:val="29"/>
     <w:rsid w:val="00CD16AB"/>
     <w:rPr>
@@ -1429,9 +1537,9 @@
       <w:color w:val="404040" w:themeColor="text1" w:themeTint="BF"/>
     </w:rPr>
   </w:style>
-  <w:style w:type="paragraph" w:styleId="Listenabsatz">
+  <w:style w:type="paragraph" w:styleId="ListParagraph">
     <w:name w:val="List Paragraph"/>
-    <w:basedOn w:val="Standard"/>
+    <w:basedOn w:val="Normal"/>
     <w:uiPriority w:val="34"/>
     <w:qFormat/>
     <w:rsid w:val="00CD16AB"/>
@@ -1440,9 +1548,9 @@
       <w:contextualSpacing/>
     </w:pPr>
   </w:style>
-  <w:style w:type="character" w:styleId="IntensiveHervorhebung">
+  <w:style w:type="character" w:styleId="IntenseEmphasis">
     <w:name w:val="Intense Emphasis"/>
-    <w:basedOn w:val="Absatz-Standardschriftart"/>
+    <w:basedOn w:val="DefaultParagraphFont"/>
     <w:uiPriority w:val="21"/>
     <w:qFormat/>
     <w:rsid w:val="00CD16AB"/>
@@ -1452,11 +1560,11 @@
       <w:color w:val="0F4761" w:themeColor="accent1" w:themeShade="BF"/>
     </w:rPr>
   </w:style>
-  <w:style w:type="paragraph" w:styleId="IntensivesZitat">
+  <w:style w:type="paragraph" w:styleId="IntenseQuote">
     <w:name w:val="Intense Quote"/>
-    <w:basedOn w:val="Standard"/>
-    <w:next w:val="Standard"/>
-    <w:link w:val="IntensivesZitatZchn"/>
+    <w:basedOn w:val="Normal"/>
+    <w:next w:val="Normal"/>
+    <w:link w:val="IntenseQuoteChar"/>
     <w:uiPriority w:val="30"/>
     <w:qFormat/>
     <w:rsid w:val="00CD16AB"/>
@@ -1475,10 +1583,10 @@
       <w:color w:val="0F4761" w:themeColor="accent1" w:themeShade="BF"/>
     </w:rPr>
   </w:style>
-  <w:style w:type="character" w:customStyle="1" w:styleId="IntensivesZitatZchn">
-    <w:name w:val="Intensives Zitat Zchn"/>
-    <w:basedOn w:val="Absatz-Standardschriftart"/>
-    <w:link w:val="IntensivesZitat"/>
+  <w:style w:type="character" w:customStyle="1" w:styleId="IntenseQuoteChar">
+    <w:name w:val="Intense Quote Char"/>
+    <w:basedOn w:val="DefaultParagraphFont"/>
+    <w:link w:val="IntenseQuote"/>
     <w:uiPriority w:val="30"/>
     <w:rsid w:val="00CD16AB"/>
     <w:rPr>
@@ -1487,9 +1595,9 @@
       <w:color w:val="0F4761" w:themeColor="accent1" w:themeShade="BF"/>
     </w:rPr>
   </w:style>
-  <w:style w:type="character" w:styleId="IntensiverVerweis">
+  <w:style w:type="character" w:styleId="IntenseReference">
     <w:name w:val="Intense Reference"/>
-    <w:basedOn w:val="Absatz-Standardschriftart"/>
+    <w:basedOn w:val="DefaultParagraphFont"/>
     <w:uiPriority w:val="32"/>
     <w:qFormat/>
     <w:rsid w:val="00CD16AB"/>

</xml_diff>